<commit_message>
docs(oms): complete D11 and D12 handover
</commit_message>
<xml_diff>
--- a/documentation/OMS_Administrator_Guide.docx
+++ b/documentation/OMS_Administrator_Guide.docx
@@ -21,7 +21,7 @@
     </w:p>
     <w:p>
       <w:r>
-        <w:t>OMS — Operational Management System | Version: MVP D0–D10 | 20 August 2026</w:t>
+        <w:t>OMS — Operational Management System | Version: MVP D0–D12 | 20 August 2026</w:t>
       </w:r>
     </w:p>
     <w:p>
@@ -80,6 +80,14 @@
       </w:pPr>
       <w:r>
         <w:t>Container build: docker build -t oms:local .  Start it with DATABASE_URL, DATABASE_USER, DATABASE_PASSWORD and OMS_JWT_SECRET. The health endpoint is GET /api/v1/health.</w:t>
+      </w:r>
+    </w:p>
+    <w:p>
+      <w:pPr>
+        <w:pStyle w:val="ListBullet"/>
+      </w:pPr>
+      <w:r>
+        <w:t>Production-like Compose start: copy .env.example to an untracked .env, replace every placeholder, then run docker compose up -d --build. Docker builds the Java 21 server and packaged Wasm UI from source. The oms service waits for MySQL health, persists database/uploads in named volumes, and exposes UI/API on OMS_PORT (8080 by default). Confirm GET /health and GET /api/v1/health before release smoke tests.</w:t>
       </w:r>
     </w:p>
     <w:p>
@@ -356,6 +364,166 @@
           <w:tcPr>
             <w:tcW w:type="dxa" w:w="3264"/>
             <w:vAlign w:val="center"/>
+          </w:tcPr>
+          <w:p>
+            <w:r>
+              <w:t>Optional</w:t>
+            </w:r>
+          </w:p>
+        </w:tc>
+      </w:tr>
+      <w:tr>
+        <w:tc>
+          <w:tcPr>
+            <w:tcW w:type="dxa" w:w="3264"/>
+          </w:tcPr>
+          <w:p>
+            <w:r>
+              <w:t>MYSQL_ROOT_PASSWORD</w:t>
+            </w:r>
+          </w:p>
+        </w:tc>
+        <w:tc>
+          <w:tcPr>
+            <w:tcW w:type="dxa" w:w="3264"/>
+          </w:tcPr>
+          <w:p>
+            <w:r>
+              <w:t>Compose-only MySQL root initialization secret</w:t>
+            </w:r>
+          </w:p>
+        </w:tc>
+        <w:tc>
+          <w:tcPr>
+            <w:tcW w:type="dxa" w:w="3264"/>
+          </w:tcPr>
+          <w:p>
+            <w:r>
+              <w:t>Yes for Compose</w:t>
+            </w:r>
+          </w:p>
+        </w:tc>
+      </w:tr>
+      <w:tr>
+        <w:tc>
+          <w:tcPr>
+            <w:tcW w:type="dxa" w:w="3264"/>
+          </w:tcPr>
+          <w:p>
+            <w:r>
+              <w:t>MYSQL_DATABASE</w:t>
+            </w:r>
+          </w:p>
+        </w:tc>
+        <w:tc>
+          <w:tcPr>
+            <w:tcW w:type="dxa" w:w="3264"/>
+          </w:tcPr>
+          <w:p>
+            <w:r>
+              <w:t>Compose database name (default usif)</w:t>
+            </w:r>
+          </w:p>
+        </w:tc>
+        <w:tc>
+          <w:tcPr>
+            <w:tcW w:type="dxa" w:w="3264"/>
+          </w:tcPr>
+          <w:p>
+            <w:r>
+              <w:t>Optional</w:t>
+            </w:r>
+          </w:p>
+        </w:tc>
+      </w:tr>
+      <w:tr>
+        <w:tc>
+          <w:tcPr>
+            <w:tcW w:type="dxa" w:w="3264"/>
+          </w:tcPr>
+          <w:p>
+            <w:r>
+              <w:t>DATABASE_DIALECT</w:t>
+            </w:r>
+          </w:p>
+        </w:tc>
+        <w:tc>
+          <w:tcPr>
+            <w:tcW w:type="dxa" w:w="3264"/>
+          </w:tcPr>
+          <w:p>
+            <w:r>
+              <w:t>mysql or tidb migration set</w:t>
+            </w:r>
+          </w:p>
+        </w:tc>
+        <w:tc>
+          <w:tcPr>
+            <w:tcW w:type="dxa" w:w="3264"/>
+          </w:tcPr>
+          <w:p>
+            <w:r>
+              <w:t>Optional</w:t>
+            </w:r>
+          </w:p>
+        </w:tc>
+      </w:tr>
+      <w:tr>
+        <w:tc>
+          <w:tcPr>
+            <w:tcW w:type="dxa" w:w="3264"/>
+          </w:tcPr>
+          <w:p>
+            <w:r>
+              <w:t>DATABASE_POOL_*</w:t>
+            </w:r>
+          </w:p>
+        </w:tc>
+        <w:tc>
+          <w:tcPr>
+            <w:tcW w:type="dxa" w:w="3264"/>
+          </w:tcPr>
+          <w:p>
+            <w:r>
+              <w:t>JDBC maximum/minimum pool sizing</w:t>
+            </w:r>
+          </w:p>
+        </w:tc>
+        <w:tc>
+          <w:tcPr>
+            <w:tcW w:type="dxa" w:w="3264"/>
+          </w:tcPr>
+          <w:p>
+            <w:r>
+              <w:t>Optional</w:t>
+            </w:r>
+          </w:p>
+        </w:tc>
+      </w:tr>
+      <w:tr>
+        <w:tc>
+          <w:tcPr>
+            <w:tcW w:type="dxa" w:w="3264"/>
+          </w:tcPr>
+          <w:p>
+            <w:r>
+              <w:t>OMS_LOG_LEVEL</w:t>
+            </w:r>
+          </w:p>
+        </w:tc>
+        <w:tc>
+          <w:tcPr>
+            <w:tcW w:type="dxa" w:w="3264"/>
+          </w:tcPr>
+          <w:p>
+            <w:r>
+              <w:t>Runtime log threshold; INFO default</w:t>
+            </w:r>
+          </w:p>
+        </w:tc>
+        <w:tc>
+          <w:tcPr>
+            <w:tcW w:type="dxa" w:w="3264"/>
           </w:tcPr>
           <w:p>
             <w:r>

</xml_diff>